<commit_message>
add RStudio files to .gitignore
</commit_message>
<xml_diff>
--- a/Writing/Manuscript Outline MIX HY in-ovo.docx
+++ b/Writing/Manuscript Outline MIX HY in-ovo.docx
@@ -787,6 +787,48 @@
           <w:rFonts w:ascii="Times New Roman" w:hAnsi="Times New Roman" w:cs="Times New Roman"/>
         </w:rPr>
         <w:t>Acknowledgement</w:t>
+      </w:r>
+    </w:p>
+    <w:p>
+      <w:pPr>
+        <w:pStyle w:val="ListParagraph"/>
+        <w:numPr>
+          <w:ilvl w:val="0"/>
+          <w:numId w:val="2"/>
+        </w:numPr>
+        <w:rPr>
+          <w:rFonts w:ascii="Times New Roman" w:hAnsi="Times New Roman" w:cs="Times New Roman"/>
+        </w:rPr>
+      </w:pPr>
+      <w:r>
+        <w:rPr>
+          <w:rFonts w:ascii="Times New Roman" w:hAnsi="Times New Roman" w:cs="Times New Roman"/>
+        </w:rPr>
+        <w:t>Vicky Simon</w:t>
+      </w:r>
+      <w:r>
+        <w:rPr>
+          <w:rFonts w:ascii="Times New Roman" w:hAnsi="Times New Roman" w:cs="Times New Roman"/>
+        </w:rPr>
+        <w:t xml:space="preserve">, </w:t>
+      </w:r>
+      <w:r>
+        <w:rPr>
+          <w:rFonts w:ascii="Times New Roman" w:hAnsi="Times New Roman" w:cs="Times New Roman"/>
+        </w:rPr>
+        <w:t>Manager of the Human Nutritional Chemistry Service Laboratory</w:t>
+      </w:r>
+      <w:r>
+        <w:rPr>
+          <w:rFonts w:ascii="Times New Roman" w:hAnsi="Times New Roman" w:cs="Times New Roman"/>
+        </w:rPr>
+        <w:t xml:space="preserve">, </w:t>
+      </w:r>
+      <w:r>
+        <w:rPr>
+          <w:rFonts w:ascii="Times New Roman" w:hAnsi="Times New Roman" w:cs="Times New Roman"/>
+        </w:rPr>
+        <w:t>Cornell University</w:t>
       </w:r>
     </w:p>
     <w:p>
@@ -910,8 +952,124 @@
       </w:pPr>
     </w:lvl>
   </w:abstractNum>
+  <w:abstractNum w:abstractNumId="1" w15:restartNumberingAfterBreak="0">
+    <w:nsid w:val="4DC37CDC"/>
+    <w:multiLevelType w:val="hybridMultilevel"/>
+    <w:tmpl w:val="9FCAA34E"/>
+    <w:lvl w:ilvl="0" w:tplc="04090001">
+      <w:start w:val="1"/>
+      <w:numFmt w:val="bullet"/>
+      <w:lvlText w:val=""/>
+      <w:lvlJc w:val="left"/>
+      <w:pPr>
+        <w:ind w:left="720" w:hanging="360"/>
+      </w:pPr>
+      <w:rPr>
+        <w:rFonts w:ascii="Symbol" w:hAnsi="Symbol" w:hint="default"/>
+      </w:rPr>
+    </w:lvl>
+    <w:lvl w:ilvl="1" w:tplc="04090003" w:tentative="1">
+      <w:start w:val="1"/>
+      <w:numFmt w:val="bullet"/>
+      <w:lvlText w:val="o"/>
+      <w:lvlJc w:val="left"/>
+      <w:pPr>
+        <w:ind w:left="1440" w:hanging="360"/>
+      </w:pPr>
+      <w:rPr>
+        <w:rFonts w:ascii="Courier New" w:hAnsi="Courier New" w:cs="Courier New" w:hint="default"/>
+      </w:rPr>
+    </w:lvl>
+    <w:lvl w:ilvl="2" w:tplc="04090005" w:tentative="1">
+      <w:start w:val="1"/>
+      <w:numFmt w:val="bullet"/>
+      <w:lvlText w:val=""/>
+      <w:lvlJc w:val="left"/>
+      <w:pPr>
+        <w:ind w:left="2160" w:hanging="360"/>
+      </w:pPr>
+      <w:rPr>
+        <w:rFonts w:ascii="Wingdings" w:hAnsi="Wingdings" w:hint="default"/>
+      </w:rPr>
+    </w:lvl>
+    <w:lvl w:ilvl="3" w:tplc="04090001" w:tentative="1">
+      <w:start w:val="1"/>
+      <w:numFmt w:val="bullet"/>
+      <w:lvlText w:val=""/>
+      <w:lvlJc w:val="left"/>
+      <w:pPr>
+        <w:ind w:left="2880" w:hanging="360"/>
+      </w:pPr>
+      <w:rPr>
+        <w:rFonts w:ascii="Symbol" w:hAnsi="Symbol" w:hint="default"/>
+      </w:rPr>
+    </w:lvl>
+    <w:lvl w:ilvl="4" w:tplc="04090003" w:tentative="1">
+      <w:start w:val="1"/>
+      <w:numFmt w:val="bullet"/>
+      <w:lvlText w:val="o"/>
+      <w:lvlJc w:val="left"/>
+      <w:pPr>
+        <w:ind w:left="3600" w:hanging="360"/>
+      </w:pPr>
+      <w:rPr>
+        <w:rFonts w:ascii="Courier New" w:hAnsi="Courier New" w:cs="Courier New" w:hint="default"/>
+      </w:rPr>
+    </w:lvl>
+    <w:lvl w:ilvl="5" w:tplc="04090005" w:tentative="1">
+      <w:start w:val="1"/>
+      <w:numFmt w:val="bullet"/>
+      <w:lvlText w:val=""/>
+      <w:lvlJc w:val="left"/>
+      <w:pPr>
+        <w:ind w:left="4320" w:hanging="360"/>
+      </w:pPr>
+      <w:rPr>
+        <w:rFonts w:ascii="Wingdings" w:hAnsi="Wingdings" w:hint="default"/>
+      </w:rPr>
+    </w:lvl>
+    <w:lvl w:ilvl="6" w:tplc="04090001" w:tentative="1">
+      <w:start w:val="1"/>
+      <w:numFmt w:val="bullet"/>
+      <w:lvlText w:val=""/>
+      <w:lvlJc w:val="left"/>
+      <w:pPr>
+        <w:ind w:left="5040" w:hanging="360"/>
+      </w:pPr>
+      <w:rPr>
+        <w:rFonts w:ascii="Symbol" w:hAnsi="Symbol" w:hint="default"/>
+      </w:rPr>
+    </w:lvl>
+    <w:lvl w:ilvl="7" w:tplc="04090003" w:tentative="1">
+      <w:start w:val="1"/>
+      <w:numFmt w:val="bullet"/>
+      <w:lvlText w:val="o"/>
+      <w:lvlJc w:val="left"/>
+      <w:pPr>
+        <w:ind w:left="5760" w:hanging="360"/>
+      </w:pPr>
+      <w:rPr>
+        <w:rFonts w:ascii="Courier New" w:hAnsi="Courier New" w:cs="Courier New" w:hint="default"/>
+      </w:rPr>
+    </w:lvl>
+    <w:lvl w:ilvl="8" w:tplc="04090005" w:tentative="1">
+      <w:start w:val="1"/>
+      <w:numFmt w:val="bullet"/>
+      <w:lvlText w:val=""/>
+      <w:lvlJc w:val="left"/>
+      <w:pPr>
+        <w:ind w:left="6480" w:hanging="360"/>
+      </w:pPr>
+      <w:rPr>
+        <w:rFonts w:ascii="Wingdings" w:hAnsi="Wingdings" w:hint="default"/>
+      </w:rPr>
+    </w:lvl>
+  </w:abstractNum>
   <w:num w:numId="1" w16cid:durableId="1133868758">
     <w:abstractNumId w:val="0"/>
+  </w:num>
+  <w:num w:numId="2" w16cid:durableId="1105807359">
+    <w:abstractNumId w:val="1"/>
   </w:num>
 </w:numbering>
 </file>
@@ -1519,7 +1677,6 @@
   <w:style w:type="character" w:default="1" w:styleId="DefaultParagraphFont">
     <w:name w:val="Default Paragraph Font"/>
     <w:uiPriority w:val="1"/>
-    <w:semiHidden/>
     <w:unhideWhenUsed/>
   </w:style>
   <w:style w:type="table" w:default="1" w:styleId="TableNormal">

</xml_diff>